<commit_message>
Gera contrato de Acordo de Divida direto em PDF, com assinaturas
Corrige contrato de acordo de divida que estava gerando docx com metade
dos campos em branco. Agora gera PDF (mesmo padrao da Declaracao de
Pagamentos) com todas as clausulas preenchidas e as 3 assinaturas
(credora + 2 testemunhas) embutidas como imagem.
</commit_message>
<xml_diff>
--- a/src/main/webapp/modeloAcordoDivida.docx
+++ b/src/main/webapp/modeloAcordoDivida.docx
@@ -1213,25 +1213,23 @@
           <w:szCs w:val="24"/>
           <w:lang w:eastAsia="pt-BR"/>
         </w:rPr>
-        <w:t xml:space="preserve">Juros de </w:t>
-      </w:r>
-      <w:r>
-        <w:rPr>
-          <w:rFonts w:asciiTheme="minorHAnsi" w:eastAsia="Times New Roman" w:hAnsiTheme="minorHAnsi" w:cstheme="minorHAnsi"/>
-          <w:sz w:val="24"/>
-          <w:szCs w:val="24"/>
-          <w:lang w:eastAsia="pt-BR"/>
-        </w:rPr>
-        <w:t xml:space="preserve">1% </w:t>
-      </w:r>
-      <w:r>
-        <w:rPr>
-          <w:rFonts w:asciiTheme="minorHAnsi" w:eastAsia="Times New Roman" w:hAnsiTheme="minorHAnsi" w:cstheme="minorHAnsi"/>
-          <w:sz w:val="24"/>
-          <w:szCs w:val="24"/>
-          <w:lang w:eastAsia="pt-BR"/>
-        </w:rPr>
-        <w:t xml:space="preserve"> ao mês sobre o valor em aberto até o efetivo pagamento.</w:t>
+        <w:t>Juros de R$ 0,50 (cinquenta centavos) por boleto, por dia de atraso, até o efetivo pagamento.</w:t>
+      </w:r>
+      <w:r>
+        <w:rPr>
+          <w:rFonts w:asciiTheme="minorHAnsi" w:eastAsia="Times New Roman" w:hAnsiTheme="minorHAnsi" w:cstheme="minorHAnsi"/>
+          <w:sz w:val="24"/>
+          <w:szCs w:val="24"/>
+          <w:lang w:eastAsia="pt-BR"/>
+        </w:rPr>
+      </w:r>
+      <w:r>
+        <w:rPr>
+          <w:rFonts w:asciiTheme="minorHAnsi" w:eastAsia="Times New Roman" w:hAnsiTheme="minorHAnsi" w:cstheme="minorHAnsi"/>
+          <w:sz w:val="24"/>
+          <w:szCs w:val="24"/>
+          <w:lang w:eastAsia="pt-BR"/>
+        </w:rPr>
       </w:r>
     </w:p>
     <w:p>
@@ -2033,7 +2031,7 @@
         <w:rPr>
           <w:lang w:eastAsia="pt-BR"/>
         </w:rPr>
-        <w:t>Nome:</w:t>
+        <w:t>Nome: adonainomeresponsavel</w:t>
       </w:r>
     </w:p>
     <w:p>
@@ -2047,7 +2045,7 @@
         <w:rPr>
           <w:lang w:eastAsia="pt-BR"/>
         </w:rPr>
-        <w:t>CPF:</w:t>
+        <w:t>CPF: adonaicpfresponsavel</w:t>
       </w:r>
     </w:p>
     <w:p>

</xml_diff>